<commit_message>
feat: đồng bộ portfolio bản mới, CV mới, ảnh webp và viết lại README
Xoá demo/, assets/cv.pdf và ảnh PNG không còn dùng.
</commit_message>
<xml_diff>
--- a/Tran_Quoc_Duy_Khoi_Java_Backend_Intern_CV.docx
+++ b/Tran_Quoc_Duy_Khoi_Java_Backend_Intern_CV.docx
@@ -10,15 +10,15 @@
           <w:rFonts w:ascii="Calibri" w:hAnsi="Calibri" w:cs="Calibri"/>
           <w:b/>
           <w:color w:val="0F172A"/>
-          <w:sz w:val="38"/>
-        </w:rPr>
-      </w:pPr>
-      <w:r>
-        <w:rPr>
-          <w:rFonts w:ascii="Calibri" w:hAnsi="Calibri" w:cs="Calibri"/>
-          <w:b/>
-          <w:color w:val="0F172A"/>
-          <w:sz w:val="38"/>
+          <w:sz w:val="40"/>
+        </w:rPr>
+      </w:pPr>
+      <w:r>
+        <w:rPr>
+          <w:rFonts w:ascii="Calibri" w:hAnsi="Calibri" w:cs="Calibri"/>
+          <w:b/>
+          <w:color w:val="0F172A"/>
+          <w:sz w:val="40"/>
         </w:rPr>
         <w:t>TRAN QUOC DUY KHOI</w:t>
       </w:r>
@@ -31,7 +31,7 @@
           <w:rFonts w:ascii="Calibri" w:hAnsi="Calibri" w:cs="Calibri"/>
           <w:b/>
           <w:color w:val="1E3A8A"/>
-          <w:sz w:val="21"/>
+          <w:sz w:val="23"/>
         </w:rPr>
       </w:pPr>
       <w:r>
@@ -39,7 +39,7 @@
           <w:rFonts w:ascii="Calibri" w:hAnsi="Calibri" w:cs="Calibri"/>
           <w:b/>
           <w:color w:val="1E3A8A"/>
-          <w:sz w:val="21"/>
+          <w:sz w:val="23"/>
         </w:rPr>
         <w:t>JAVA BACKEND DEVELOPER INTERN</w:t>
       </w:r>
@@ -51,21 +51,25 @@
         <w:rPr>
           <w:rFonts w:ascii="Calibri" w:hAnsi="Calibri" w:cs="Calibri"/>
           <w:color w:val="475569"/>
-          <w:sz w:val="17"/>
+          <w:sz w:val="18"/>
         </w:rPr>
       </w:pPr>
       <w:r>
         <w:rPr>
           <w:rFonts w:ascii="Calibri" w:hAnsi="Calibri" w:cs="Calibri"/>
           <w:color w:val="475569"/>
-          <w:sz w:val="17"/>
-        </w:rPr>
-        <w:t xml:space="preserve">Phone: 0929648427   |   Email: </w:t>
+          <w:sz w:val="18"/>
+        </w:rPr>
+        <w:t xml:space="preserve">Phone: (+84) 929 648 427   |   Email: </w:t>
       </w:r>
       <w:hyperlink r:id="rId4" w:history="1">
         <w:r>
           <w:rPr>
             <w:rStyle w:val="Hyperlink"/>
+            <w:rFonts w:ascii="Calibri" w:hAnsi="Calibri" w:cs="Calibri"/>
+            <w:color w:val="1D4ED8"/>
+            <w:sz w:val="18"/>
+            <w:u w:val="none"/>
           </w:rPr>
           <w:t>tranquocduykhoi@gmail.com</w:t>
         </w:r>
@@ -74,7 +78,7 @@
         <w:rPr>
           <w:rFonts w:ascii="Calibri" w:hAnsi="Calibri" w:cs="Calibri"/>
           <w:color w:val="475569"/>
-          <w:sz w:val="17"/>
+          <w:sz w:val="18"/>
         </w:rPr>
         <w:t xml:space="preserve">   |   Availability: Full-time Internship</w:t>
       </w:r>
@@ -86,14 +90,14 @@
         <w:rPr>
           <w:rFonts w:ascii="Calibri" w:hAnsi="Calibri" w:cs="Calibri"/>
           <w:color w:val="1E293B"/>
-          <w:sz w:val="17"/>
+          <w:sz w:val="18"/>
         </w:rPr>
       </w:pPr>
       <w:r>
         <w:rPr>
           <w:rFonts w:ascii="Calibri" w:hAnsi="Calibri" w:cs="Calibri"/>
           <w:color w:val="475569"/>
-          <w:sz w:val="17"/>
+          <w:sz w:val="18"/>
         </w:rPr>
         <w:t xml:space="preserve">GitHub: </w:t>
       </w:r>
@@ -101,6 +105,10 @@
         <w:r>
           <w:rPr>
             <w:rStyle w:val="Hyperlink"/>
+            <w:rFonts w:ascii="Calibri" w:hAnsi="Calibri" w:cs="Calibri"/>
+            <w:color w:val="1D4ED8"/>
+            <w:sz w:val="18"/>
+            <w:u w:val="none"/>
           </w:rPr>
           <w:t>github.com/DuyKhoi282</w:t>
         </w:r>
@@ -109,7 +117,7 @@
         <w:rPr>
           <w:rFonts w:ascii="Calibri" w:hAnsi="Calibri" w:cs="Calibri"/>
           <w:color w:val="475569"/>
-          <w:sz w:val="17"/>
+          <w:sz w:val="18"/>
         </w:rPr>
         <w:t xml:space="preserve">   |   Portfolio: </w:t>
       </w:r>
@@ -117,6 +125,10 @@
         <w:r>
           <w:rPr>
             <w:rStyle w:val="Hyperlink"/>
+            <w:rFonts w:ascii="Calibri" w:hAnsi="Calibri" w:cs="Calibri"/>
+            <w:color w:val="1D4ED8"/>
+            <w:sz w:val="18"/>
+            <w:u w:val="none"/>
           </w:rPr>
           <w:t>duykhoi-portfolio.netlify.app</w:t>
         </w:r>
@@ -128,42 +140,40 @@
         <w:pBdr>
           <w:bottom w:val="single" w:sz="6" w:space="1" w:color="CBD5E1"/>
         </w:pBdr>
-        <w:spacing w:before="76" w:after="36" w:line="240" w:lineRule="auto"/>
-        <w:rPr>
-          <w:rFonts w:ascii="Calibri" w:hAnsi="Calibri" w:cs="Calibri"/>
-          <w:b/>
-          <w:color w:val="0F172A"/>
-          <w:sz w:val="20"/>
-        </w:rPr>
-      </w:pPr>
-      <w:r>
-        <w:rPr>
-          <w:rFonts w:ascii="Calibri" w:hAnsi="Calibri" w:cs="Calibri"/>
-          <w:b/>
-          <w:color w:val="0F172A"/>
-          <w:sz w:val="20"/>
-        </w:rPr>
-        <w:t>CAREER OBJECTIVE</w:t>
-      </w:r>
-    </w:p>
-    <w:p>
-      <w:pPr>
-        <w:keepNext/>
-        <w:spacing w:after="0" w:line="240" w:lineRule="auto"/>
+        <w:spacing w:before="140" w:after="60" w:line="240" w:lineRule="auto"/>
+        <w:rPr>
+          <w:rFonts w:ascii="Calibri" w:hAnsi="Calibri" w:cs="Calibri"/>
+          <w:b/>
+          <w:color w:val="0F172A"/>
+        </w:rPr>
+      </w:pPr>
+      <w:r>
+        <w:rPr>
+          <w:rFonts w:ascii="Calibri" w:hAnsi="Calibri" w:cs="Calibri"/>
+          <w:b/>
+          <w:color w:val="0F172A"/>
+        </w:rPr>
+        <w:t>SUMMARY</w:t>
+      </w:r>
+    </w:p>
+    <w:p>
+      <w:pPr>
+        <w:keepNext/>
+        <w:spacing w:after="60" w:line="240" w:lineRule="auto"/>
         <w:jc w:val="both"/>
         <w:rPr>
           <w:rFonts w:ascii="Calibri" w:hAnsi="Calibri" w:cs="Calibri"/>
           <w:color w:val="1E293B"/>
-          <w:sz w:val="18"/>
-        </w:rPr>
-      </w:pPr>
-      <w:r>
-        <w:rPr>
-          <w:rFonts w:ascii="Calibri" w:hAnsi="Calibri" w:cs="Calibri"/>
-          <w:color w:val="1E293B"/>
-          <w:sz w:val="18"/>
-        </w:rPr>
-        <w:t>To develop my career as a Java Backend Developer by improving my Java, Spring Framework, database, and backend development skills. Seeking a full-time internship to gain practical experience, strengthen problem-solving abilities, and contribute to real-world software projects.</w:t>
+          <w:sz w:val="19"/>
+        </w:rPr>
+      </w:pPr>
+      <w:r>
+        <w:rPr>
+          <w:rFonts w:ascii="Calibri" w:hAnsi="Calibri" w:cs="Calibri"/>
+          <w:color w:val="1E293B"/>
+          <w:sz w:val="19"/>
+        </w:rPr>
+        <w:t>Final-year IT student focused on Java backend development. Hands-on experience building layered web applications with Java, Spring MVC and MySQL, designing relational database schemas, and writing secure, parameterized SQL. Seeking a full-time Java Backend internship to build production-grade services with Spring Boot.</w:t>
       </w:r>
     </w:p>
     <w:p>
@@ -172,11 +182,32 @@
         <w:pBdr>
           <w:bottom w:val="single" w:sz="6" w:space="1" w:color="CBD5E1"/>
         </w:pBdr>
-        <w:spacing w:before="76" w:after="36" w:line="240" w:lineRule="auto"/>
-        <w:rPr>
-          <w:rFonts w:ascii="Calibri" w:hAnsi="Calibri" w:cs="Calibri"/>
-          <w:b/>
-          <w:color w:val="0F172A"/>
+        <w:spacing w:before="140" w:after="60" w:line="240" w:lineRule="auto"/>
+        <w:rPr>
+          <w:rFonts w:ascii="Calibri" w:hAnsi="Calibri" w:cs="Calibri"/>
+          <w:b/>
+          <w:color w:val="0F172A"/>
+        </w:rPr>
+      </w:pPr>
+      <w:r>
+        <w:rPr>
+          <w:rFonts w:ascii="Calibri" w:hAnsi="Calibri" w:cs="Calibri"/>
+          <w:b/>
+          <w:color w:val="0F172A"/>
+        </w:rPr>
+        <w:t>EDUCATION</w:t>
+      </w:r>
+    </w:p>
+    <w:p>
+      <w:pPr>
+        <w:keepNext/>
+        <w:tabs>
+          <w:tab w:val="right" w:pos="10540"/>
+        </w:tabs>
+        <w:spacing w:after="20" w:line="240" w:lineRule="auto"/>
+        <w:rPr>
+          <w:rFonts w:ascii="Calibri" w:hAnsi="Calibri" w:cs="Calibri"/>
+          <w:color w:val="475569"/>
           <w:sz w:val="20"/>
         </w:rPr>
       </w:pPr>
@@ -187,45 +218,22 @@
           <w:color w:val="0F172A"/>
           <w:sz w:val="20"/>
         </w:rPr>
-        <w:t>EDUCATION</w:t>
-      </w:r>
-    </w:p>
-    <w:p>
-      <w:pPr>
-        <w:keepNext/>
-        <w:tabs>
-          <w:tab w:val="right" w:pos="10540"/>
-        </w:tabs>
-        <w:spacing w:after="20" w:line="240" w:lineRule="auto"/>
+        <w:t>University of Economics and Finance (UEF)</w:t>
+      </w:r>
+      <w:r>
+        <w:rPr>
+          <w:rFonts w:ascii="Calibri" w:hAnsi="Calibri" w:cs="Calibri"/>
+          <w:b/>
+          <w:color w:val="0F172A"/>
+          <w:sz w:val="20"/>
+        </w:rPr>
+        <w:tab/>
+      </w:r>
+      <w:r>
         <w:rPr>
           <w:rFonts w:ascii="Calibri" w:hAnsi="Calibri" w:cs="Calibri"/>
           <w:color w:val="475569"/>
-          <w:sz w:val="18"/>
-        </w:rPr>
-      </w:pPr>
-      <w:r>
-        <w:rPr>
-          <w:rFonts w:ascii="Calibri" w:hAnsi="Calibri" w:cs="Calibri"/>
-          <w:b/>
-          <w:color w:val="0F172A"/>
-          <w:sz w:val="18"/>
-        </w:rPr>
-        <w:t>University of Economics and Finance (UEF)</w:t>
-      </w:r>
-      <w:r>
-        <w:rPr>
-          <w:rFonts w:ascii="Calibri" w:hAnsi="Calibri" w:cs="Calibri"/>
-          <w:b/>
-          <w:color w:val="0F172A"/>
-          <w:sz w:val="18"/>
-        </w:rPr>
-        <w:tab/>
-      </w:r>
-      <w:r>
-        <w:rPr>
-          <w:rFonts w:ascii="Calibri" w:hAnsi="Calibri" w:cs="Calibri"/>
-          <w:color w:val="475569"/>
-          <w:sz w:val="18"/>
+          <w:sz w:val="20"/>
         </w:rPr>
         <w:t>Expected Graduation: 2027</w:t>
       </w:r>
@@ -236,18 +244,18 @@
         <w:tabs>
           <w:tab w:val="right" w:pos="10540"/>
         </w:tabs>
-        <w:spacing w:after="0" w:line="240" w:lineRule="auto"/>
-        <w:rPr>
-          <w:rFonts w:ascii="Calibri" w:hAnsi="Calibri" w:cs="Calibri"/>
-          <w:color w:val="1E293B"/>
-          <w:sz w:val="18"/>
-        </w:rPr>
-      </w:pPr>
-      <w:r>
-        <w:rPr>
-          <w:rFonts w:ascii="Calibri" w:hAnsi="Calibri" w:cs="Calibri"/>
-          <w:color w:val="1E293B"/>
-          <w:sz w:val="18"/>
+        <w:spacing w:after="60" w:line="240" w:lineRule="auto"/>
+        <w:rPr>
+          <w:rFonts w:ascii="Calibri" w:hAnsi="Calibri" w:cs="Calibri"/>
+          <w:color w:val="1E293B"/>
+          <w:sz w:val="19"/>
+        </w:rPr>
+      </w:pPr>
+      <w:r>
+        <w:rPr>
+          <w:rFonts w:ascii="Calibri" w:hAnsi="Calibri" w:cs="Calibri"/>
+          <w:color w:val="1E293B"/>
+          <w:sz w:val="19"/>
         </w:rPr>
         <w:t>Bachelor of Information Technology   |   Final-year student</w:t>
       </w:r>
@@ -261,20 +269,18 @@
         <w:tabs>
           <w:tab w:val="right" w:pos="10540"/>
         </w:tabs>
-        <w:spacing w:before="76" w:after="36" w:line="240" w:lineRule="auto"/>
-        <w:rPr>
-          <w:rFonts w:ascii="Calibri" w:hAnsi="Calibri" w:cs="Calibri"/>
-          <w:b/>
-          <w:color w:val="0F172A"/>
-          <w:sz w:val="20"/>
-        </w:rPr>
-      </w:pPr>
-      <w:r>
-        <w:rPr>
-          <w:rFonts w:ascii="Calibri" w:hAnsi="Calibri" w:cs="Calibri"/>
-          <w:b/>
-          <w:color w:val="0F172A"/>
-          <w:sz w:val="20"/>
+        <w:spacing w:before="140" w:after="60" w:line="240" w:lineRule="auto"/>
+        <w:rPr>
+          <w:rFonts w:ascii="Calibri" w:hAnsi="Calibri" w:cs="Calibri"/>
+          <w:b/>
+          <w:color w:val="0F172A"/>
+        </w:rPr>
+      </w:pPr>
+      <w:r>
+        <w:rPr>
+          <w:rFonts w:ascii="Calibri" w:hAnsi="Calibri" w:cs="Calibri"/>
+          <w:b/>
+          <w:color w:val="0F172A"/>
         </w:rPr>
         <w:t>TECHNICAL SKILLS</w:t>
       </w:r>
@@ -289,25 +295,25 @@
         <w:rPr>
           <w:rFonts w:ascii="Calibri" w:hAnsi="Calibri" w:cs="Calibri"/>
           <w:color w:val="1E293B"/>
-          <w:sz w:val="18"/>
-        </w:rPr>
-      </w:pPr>
-      <w:r>
-        <w:rPr>
-          <w:rFonts w:ascii="Calibri" w:hAnsi="Calibri" w:cs="Calibri"/>
-          <w:b/>
-          <w:color w:val="0F172A"/>
-          <w:sz w:val="18"/>
-        </w:rPr>
-        <w:t xml:space="preserve">- Programming Languages: </w:t>
-      </w:r>
-      <w:r>
-        <w:rPr>
-          <w:rFonts w:ascii="Calibri" w:hAnsi="Calibri" w:cs="Calibri"/>
-          <w:color w:val="1E293B"/>
-          <w:sz w:val="18"/>
-        </w:rPr>
-        <w:t>Java, C#</w:t>
+          <w:sz w:val="19"/>
+        </w:rPr>
+      </w:pPr>
+      <w:r>
+        <w:rPr>
+          <w:rFonts w:ascii="Calibri" w:hAnsi="Calibri" w:cs="Calibri"/>
+          <w:b/>
+          <w:color w:val="0F172A"/>
+          <w:sz w:val="19"/>
+        </w:rPr>
+        <w:t xml:space="preserve">• Languages: </w:t>
+      </w:r>
+      <w:r>
+        <w:rPr>
+          <w:rFonts w:ascii="Calibri" w:hAnsi="Calibri" w:cs="Calibri"/>
+          <w:color w:val="1E293B"/>
+          <w:sz w:val="19"/>
+        </w:rPr>
+        <w:t>Java, C#, SQL</w:t>
       </w:r>
     </w:p>
     <w:p>
@@ -320,25 +326,25 @@
         <w:rPr>
           <w:rFonts w:ascii="Calibri" w:hAnsi="Calibri" w:cs="Calibri"/>
           <w:color w:val="1E293B"/>
-          <w:sz w:val="18"/>
-        </w:rPr>
-      </w:pPr>
-      <w:r>
-        <w:rPr>
-          <w:rFonts w:ascii="Calibri" w:hAnsi="Calibri" w:cs="Calibri"/>
-          <w:b/>
-          <w:color w:val="0F172A"/>
-          <w:sz w:val="18"/>
-        </w:rPr>
-        <w:t xml:space="preserve">- Backend &amp; Web: </w:t>
-      </w:r>
-      <w:r>
-        <w:rPr>
-          <w:rFonts w:ascii="Calibri" w:hAnsi="Calibri" w:cs="Calibri"/>
-          <w:color w:val="1E293B"/>
-          <w:sz w:val="18"/>
-        </w:rPr>
-        <w:t>Spring MVC, Spring Boot (Basic), JSP &amp; Servlet</w:t>
+          <w:sz w:val="19"/>
+        </w:rPr>
+      </w:pPr>
+      <w:r>
+        <w:rPr>
+          <w:rFonts w:ascii="Calibri" w:hAnsi="Calibri" w:cs="Calibri"/>
+          <w:b/>
+          <w:color w:val="0F172A"/>
+          <w:sz w:val="19"/>
+        </w:rPr>
+        <w:t xml:space="preserve">• Backend: </w:t>
+      </w:r>
+      <w:r>
+        <w:rPr>
+          <w:rFonts w:ascii="Calibri" w:hAnsi="Calibri" w:cs="Calibri"/>
+          <w:color w:val="1E293B"/>
+          <w:sz w:val="19"/>
+        </w:rPr>
+        <w:t>Spring MVC, Spring Boot, JPA / Hibernate, JSP &amp; Servlet, ADO.NET</w:t>
       </w:r>
     </w:p>
     <w:p>
@@ -351,25 +357,25 @@
         <w:rPr>
           <w:rFonts w:ascii="Calibri" w:hAnsi="Calibri" w:cs="Calibri"/>
           <w:color w:val="1E293B"/>
-          <w:sz w:val="18"/>
-        </w:rPr>
-      </w:pPr>
-      <w:r>
-        <w:rPr>
-          <w:rFonts w:ascii="Calibri" w:hAnsi="Calibri" w:cs="Calibri"/>
-          <w:b/>
-          <w:color w:val="0F172A"/>
-          <w:sz w:val="18"/>
-        </w:rPr>
-        <w:t xml:space="preserve">- Architecture &amp; Development: </w:t>
-      </w:r>
-      <w:r>
-        <w:rPr>
-          <w:rFonts w:ascii="Calibri" w:hAnsi="Calibri" w:cs="Calibri"/>
-          <w:color w:val="1E293B"/>
-          <w:sz w:val="18"/>
-        </w:rPr>
-        <w:t>MVC Architecture, Layered Architecture, Database Design, CRUD Operations</w:t>
+          <w:sz w:val="19"/>
+        </w:rPr>
+      </w:pPr>
+      <w:r>
+        <w:rPr>
+          <w:rFonts w:ascii="Calibri" w:hAnsi="Calibri" w:cs="Calibri"/>
+          <w:b/>
+          <w:color w:val="0F172A"/>
+          <w:sz w:val="19"/>
+        </w:rPr>
+        <w:t xml:space="preserve">• Databases: </w:t>
+      </w:r>
+      <w:r>
+        <w:rPr>
+          <w:rFonts w:ascii="Calibri" w:hAnsi="Calibri" w:cs="Calibri"/>
+          <w:color w:val="1E293B"/>
+          <w:sz w:val="19"/>
+        </w:rPr>
+        <w:t>MySQL, SQL Server – schema design, PK/FK constraints, JOINs, parameterized queries</w:t>
       </w:r>
     </w:p>
     <w:p>
@@ -382,25 +388,25 @@
         <w:rPr>
           <w:rFonts w:ascii="Calibri" w:hAnsi="Calibri" w:cs="Calibri"/>
           <w:color w:val="1E293B"/>
-          <w:sz w:val="18"/>
-        </w:rPr>
-      </w:pPr>
-      <w:r>
-        <w:rPr>
-          <w:rFonts w:ascii="Calibri" w:hAnsi="Calibri" w:cs="Calibri"/>
-          <w:b/>
-          <w:color w:val="0F172A"/>
-          <w:sz w:val="18"/>
-        </w:rPr>
-        <w:t xml:space="preserve">- Databases: </w:t>
-      </w:r>
-      <w:r>
-        <w:rPr>
-          <w:rFonts w:ascii="Calibri" w:hAnsi="Calibri" w:cs="Calibri"/>
-          <w:color w:val="1E293B"/>
-          <w:sz w:val="18"/>
-        </w:rPr>
-        <w:t>MySQL, SQL Server, SQL Queries</w:t>
+          <w:sz w:val="19"/>
+        </w:rPr>
+      </w:pPr>
+      <w:r>
+        <w:rPr>
+          <w:rFonts w:ascii="Calibri" w:hAnsi="Calibri" w:cs="Calibri"/>
+          <w:b/>
+          <w:color w:val="0F172A"/>
+          <w:sz w:val="19"/>
+        </w:rPr>
+        <w:t xml:space="preserve">• Concepts: </w:t>
+      </w:r>
+      <w:r>
+        <w:rPr>
+          <w:rFonts w:ascii="Calibri" w:hAnsi="Calibri" w:cs="Calibri"/>
+          <w:color w:val="1E293B"/>
+          <w:sz w:val="19"/>
+        </w:rPr>
+        <w:t>OOP, MVC &amp; Layered Architecture (Controller–Service–DAO)</w:t>
       </w:r>
     </w:p>
     <w:p>
@@ -413,23 +419,23 @@
         <w:rPr>
           <w:rFonts w:ascii="Calibri" w:hAnsi="Calibri" w:cs="Calibri"/>
           <w:color w:val="1E293B"/>
-          <w:sz w:val="18"/>
-        </w:rPr>
-      </w:pPr>
-      <w:r>
-        <w:rPr>
-          <w:rFonts w:ascii="Calibri" w:hAnsi="Calibri" w:cs="Calibri"/>
-          <w:b/>
-          <w:color w:val="0F172A"/>
-          <w:sz w:val="18"/>
-        </w:rPr>
-        <w:t xml:space="preserve">- Tools: </w:t>
-      </w:r>
-      <w:r>
-        <w:rPr>
-          <w:rFonts w:ascii="Calibri" w:hAnsi="Calibri" w:cs="Calibri"/>
-          <w:color w:val="1E293B"/>
-          <w:sz w:val="18"/>
+          <w:sz w:val="19"/>
+        </w:rPr>
+      </w:pPr>
+      <w:r>
+        <w:rPr>
+          <w:rFonts w:ascii="Calibri" w:hAnsi="Calibri" w:cs="Calibri"/>
+          <w:b/>
+          <w:color w:val="0F172A"/>
+          <w:sz w:val="19"/>
+        </w:rPr>
+        <w:t xml:space="preserve">• Tools: </w:t>
+      </w:r>
+      <w:r>
+        <w:rPr>
+          <w:rFonts w:ascii="Calibri" w:hAnsi="Calibri" w:cs="Calibri"/>
+          <w:color w:val="1E293B"/>
+          <w:sz w:val="19"/>
         </w:rPr>
         <w:t>Maven, Git &amp; GitHub</w:t>
       </w:r>
@@ -443,14 +449,44 @@
         <w:tabs>
           <w:tab w:val="right" w:pos="10540"/>
         </w:tabs>
-        <w:spacing w:before="76" w:after="36" w:line="240" w:lineRule="auto"/>
+        <w:spacing w:before="140" w:after="60" w:line="240" w:lineRule="auto"/>
+        <w:rPr>
+          <w:rFonts w:ascii="Calibri" w:hAnsi="Calibri" w:cs="Calibri"/>
+          <w:b/>
+          <w:color w:val="0F172A"/>
+        </w:rPr>
+      </w:pPr>
+      <w:r>
+        <w:rPr>
+          <w:rFonts w:ascii="Calibri" w:hAnsi="Calibri" w:cs="Calibri"/>
+          <w:b/>
+          <w:color w:val="0F172A"/>
+        </w:rPr>
+        <w:t>ACADEMIC PROJECTS</w:t>
+      </w:r>
+    </w:p>
+    <w:p>
+      <w:pPr>
+        <w:keepNext/>
+        <w:tabs>
+          <w:tab w:val="right" w:pos="10540"/>
+        </w:tabs>
+        <w:spacing w:after="20" w:line="240" w:lineRule="auto"/>
+        <w:rPr>
+          <w:rFonts w:ascii="Calibri" w:hAnsi="Calibri" w:cs="Calibri"/>
+          <w:color w:val="475569"/>
+          <w:sz w:val="18"/>
+        </w:rPr>
+      </w:pPr>
+      <w:r>
         <w:rPr>
           <w:rFonts w:ascii="Calibri" w:hAnsi="Calibri" w:cs="Calibri"/>
           <w:b/>
           <w:color w:val="0F172A"/>
           <w:sz w:val="20"/>
         </w:rPr>
-      </w:pPr>
+        <w:t>Travel Tour Booking System</w:t>
+      </w:r>
       <w:r>
         <w:rPr>
           <w:rFonts w:ascii="Calibri" w:hAnsi="Calibri" w:cs="Calibri"/>
@@ -458,7 +494,15 @@
           <w:color w:val="0F172A"/>
           <w:sz w:val="20"/>
         </w:rPr>
-        <w:t>ACADEMIC PROJECTS</w:t>
+        <w:tab/>
+      </w:r>
+      <w:r>
+        <w:rPr>
+          <w:rFonts w:ascii="Calibri" w:hAnsi="Calibri" w:cs="Calibri"/>
+          <w:color w:val="475569"/>
+          <w:sz w:val="18"/>
+        </w:rPr>
+        <w:t>Academic Group Project</w:t>
       </w:r>
     </w:p>
     <w:p>
@@ -470,48 +514,8 @@
         <w:spacing w:after="20" w:line="240" w:lineRule="auto"/>
         <w:rPr>
           <w:rFonts w:ascii="Calibri" w:hAnsi="Calibri" w:cs="Calibri"/>
-          <w:color w:val="475569"/>
-          <w:sz w:val="17"/>
-        </w:rPr>
-      </w:pPr>
-      <w:r>
-        <w:rPr>
-          <w:rFonts w:ascii="Calibri" w:hAnsi="Calibri" w:cs="Calibri"/>
-          <w:b/>
-          <w:color w:val="0F172A"/>
-          <w:sz w:val="18"/>
-        </w:rPr>
-        <w:t>Travel Tour Booking System</w:t>
-      </w:r>
-      <w:r>
-        <w:rPr>
-          <w:rFonts w:ascii="Calibri" w:hAnsi="Calibri" w:cs="Calibri"/>
-          <w:b/>
-          <w:color w:val="0F172A"/>
-          <w:sz w:val="18"/>
-        </w:rPr>
-        <w:tab/>
-      </w:r>
-      <w:r>
-        <w:rPr>
-          <w:rFonts w:ascii="Calibri" w:hAnsi="Calibri" w:cs="Calibri"/>
-          <w:color w:val="475569"/>
-          <w:sz w:val="17"/>
-        </w:rPr>
-        <w:t>Academic Group Project</w:t>
-      </w:r>
-    </w:p>
-    <w:p>
-      <w:pPr>
-        <w:keepNext/>
-        <w:tabs>
-          <w:tab w:val="right" w:pos="10540"/>
-        </w:tabs>
-        <w:spacing w:after="20" w:line="240" w:lineRule="auto"/>
-        <w:rPr>
-          <w:rFonts w:ascii="Calibri" w:hAnsi="Calibri" w:cs="Calibri"/>
-          <w:color w:val="1E293B"/>
-          <w:sz w:val="17"/>
+          <w:color w:val="1E293B"/>
+          <w:sz w:val="19"/>
         </w:rPr>
       </w:pPr>
       <w:r>
@@ -519,7 +523,7 @@
           <w:rFonts w:ascii="Calibri" w:hAnsi="Calibri" w:cs="Calibri"/>
           <w:b/>
           <w:color w:val="1E3A8A"/>
-          <w:sz w:val="17"/>
+          <w:sz w:val="19"/>
         </w:rPr>
         <w:t xml:space="preserve">Role: </w:t>
       </w:r>
@@ -527,7 +531,7 @@
         <w:rPr>
           <w:rFonts w:ascii="Calibri" w:hAnsi="Calibri" w:cs="Calibri"/>
           <w:color w:val="1E293B"/>
-          <w:sz w:val="17"/>
+          <w:sz w:val="19"/>
         </w:rPr>
         <w:t xml:space="preserve">Booking &amp; Payment Module   |   </w:t>
       </w:r>
@@ -536,7 +540,7 @@
           <w:rFonts w:ascii="Calibri" w:hAnsi="Calibri" w:cs="Calibri"/>
           <w:b/>
           <w:color w:val="1E3A8A"/>
-          <w:sz w:val="17"/>
+          <w:sz w:val="19"/>
         </w:rPr>
         <w:t xml:space="preserve">Tech Stack: </w:t>
       </w:r>
@@ -544,7 +548,7 @@
         <w:rPr>
           <w:rFonts w:ascii="Calibri" w:hAnsi="Calibri" w:cs="Calibri"/>
           <w:color w:val="1E293B"/>
-          <w:sz w:val="17"/>
+          <w:sz w:val="19"/>
         </w:rPr>
         <w:t>Java, Spring MVC, JSP, Servlet, MySQL, Maven</w:t>
       </w:r>
@@ -560,7 +564,7 @@
           <w:rFonts w:ascii="Calibri" w:hAnsi="Calibri" w:cs="Calibri"/>
           <w:b/>
           <w:color w:val="1E293B"/>
-          <w:sz w:val="17"/>
+          <w:sz w:val="19"/>
         </w:rPr>
       </w:pPr>
       <w:r>
@@ -568,7 +572,7 @@
           <w:rFonts w:ascii="Calibri" w:hAnsi="Calibri" w:cs="Calibri"/>
           <w:b/>
           <w:color w:val="1E3A8A"/>
-          <w:sz w:val="17"/>
+          <w:sz w:val="19"/>
         </w:rPr>
         <w:t xml:space="preserve">GitHub: </w:t>
       </w:r>
@@ -576,6 +580,10 @@
         <w:r>
           <w:rPr>
             <w:rStyle w:val="Hyperlink"/>
+            <w:rFonts w:ascii="Calibri" w:hAnsi="Calibri" w:cs="Calibri"/>
+            <w:color w:val="1D4ED8"/>
+            <w:sz w:val="19"/>
+            <w:u w:val="none"/>
           </w:rPr>
           <w:t>https://github.com/vannld23/travel-tour-booking-system</w:t>
         </w:r>
@@ -593,16 +601,16 @@
         <w:rPr>
           <w:rFonts w:ascii="Calibri" w:hAnsi="Calibri" w:cs="Calibri"/>
           <w:color w:val="1E293B"/>
-          <w:sz w:val="17"/>
-        </w:rPr>
-      </w:pPr>
-      <w:r>
-        <w:rPr>
-          <w:rFonts w:ascii="Calibri" w:hAnsi="Calibri" w:cs="Calibri"/>
-          <w:color w:val="1E293B"/>
-          <w:sz w:val="17"/>
-        </w:rPr>
-        <w:t>-  Implemented booking creation, booking history tracking, and booking status management.</w:t>
+          <w:sz w:val="19"/>
+        </w:rPr>
+      </w:pPr>
+      <w:r>
+        <w:rPr>
+          <w:rFonts w:ascii="Calibri" w:hAnsi="Calibri" w:cs="Calibri"/>
+          <w:color w:val="1E293B"/>
+          <w:sz w:val="19"/>
+        </w:rPr>
+        <w:t>•  Built the booking and payment flow (create booking, payment, booking history) on a Controller–Service–DAO layered design.</w:t>
       </w:r>
     </w:p>
     <w:p>
@@ -617,16 +625,16 @@
         <w:rPr>
           <w:rFonts w:ascii="Calibri" w:hAnsi="Calibri" w:cs="Calibri"/>
           <w:color w:val="1E293B"/>
-          <w:sz w:val="17"/>
-        </w:rPr>
-      </w:pPr>
-      <w:r>
-        <w:rPr>
-          <w:rFonts w:ascii="Calibri" w:hAnsi="Calibri" w:cs="Calibri"/>
-          <w:color w:val="1E293B"/>
-          <w:sz w:val="17"/>
-        </w:rPr>
-        <w:t>-  Applied MVC layered architecture using Controller, Service, DAO, and Model layers.</w:t>
+          <w:sz w:val="19"/>
+        </w:rPr>
+      </w:pPr>
+      <w:r>
+        <w:rPr>
+          <w:rFonts w:ascii="Calibri" w:hAnsi="Calibri" w:cs="Calibri"/>
+          <w:color w:val="1E293B"/>
+          <w:sz w:val="19"/>
+        </w:rPr>
+        <w:t>•  Wrapped booking and payment creation in a single database transaction with rollback to keep data consistent on failure.</w:t>
       </w:r>
     </w:p>
     <w:p>
@@ -641,16 +649,16 @@
         <w:rPr>
           <w:rFonts w:ascii="Calibri" w:hAnsi="Calibri" w:cs="Calibri"/>
           <w:color w:val="1E293B"/>
-          <w:sz w:val="17"/>
-        </w:rPr>
-      </w:pPr>
-      <w:r>
-        <w:rPr>
-          <w:rFonts w:ascii="Calibri" w:hAnsi="Calibri" w:cs="Calibri"/>
-          <w:color w:val="1E293B"/>
-          <w:sz w:val="17"/>
-        </w:rPr>
-        <w:t>-  Implemented booking status flow: Pending, Confirmed, Completed, and Cancelled.</w:t>
+          <w:sz w:val="19"/>
+        </w:rPr>
+      </w:pPr>
+      <w:r>
+        <w:rPr>
+          <w:rFonts w:ascii="Calibri" w:hAnsi="Calibri" w:cs="Calibri"/>
+          <w:color w:val="1E293B"/>
+          <w:sz w:val="19"/>
+        </w:rPr>
+        <w:t>•  Prevented overbooking by checking remaining tour capacity before confirming, and releasing seats on cancellation.</w:t>
       </w:r>
     </w:p>
     <w:p>
@@ -665,16 +673,40 @@
         <w:rPr>
           <w:rFonts w:ascii="Calibri" w:hAnsi="Calibri" w:cs="Calibri"/>
           <w:color w:val="1E293B"/>
-          <w:sz w:val="17"/>
-        </w:rPr>
-      </w:pPr>
-      <w:r>
-        <w:rPr>
-          <w:rFonts w:ascii="Calibri" w:hAnsi="Calibri" w:cs="Calibri"/>
-          <w:color w:val="1E293B"/>
-          <w:sz w:val="17"/>
-        </w:rPr>
-        <w:t>-  Managed booking and payment-related data using MySQL.</w:t>
+          <w:sz w:val="19"/>
+        </w:rPr>
+      </w:pPr>
+      <w:r>
+        <w:rPr>
+          <w:rFonts w:ascii="Calibri" w:hAnsi="Calibri" w:cs="Calibri"/>
+          <w:color w:val="1E293B"/>
+          <w:sz w:val="19"/>
+        </w:rPr>
+        <w:t>•  Enforced a booking state machine (Pending → Confirmed → Completed / Cancelled), rejecting invalid transitions.</w:t>
+      </w:r>
+    </w:p>
+    <w:p>
+      <w:pPr>
+        <w:keepNext/>
+        <w:tabs>
+          <w:tab w:val="right" w:pos="10540"/>
+        </w:tabs>
+        <w:spacing w:after="20" w:line="240" w:lineRule="auto"/>
+        <w:ind w:left="220" w:hanging="220"/>
+        <w:jc w:val="both"/>
+        <w:rPr>
+          <w:rFonts w:ascii="Calibri" w:hAnsi="Calibri" w:cs="Calibri"/>
+          <w:color w:val="1E293B"/>
+          <w:sz w:val="19"/>
+        </w:rPr>
+      </w:pPr>
+      <w:r>
+        <w:rPr>
+          <w:rFonts w:ascii="Calibri" w:hAnsi="Calibri" w:cs="Calibri"/>
+          <w:color w:val="1E293B"/>
+          <w:sz w:val="19"/>
+        </w:rPr>
+        <w:t>•  Added server-side validation for traveler count, departure date and contact information.</w:t>
       </w:r>
     </w:p>
     <w:p>
@@ -688,16 +720,16 @@
         <w:rPr>
           <w:rFonts w:ascii="Calibri" w:hAnsi="Calibri" w:cs="Calibri"/>
           <w:color w:val="475569"/>
-          <w:sz w:val="17"/>
-        </w:rPr>
-      </w:pPr>
-      <w:r>
-        <w:rPr>
-          <w:rFonts w:ascii="Calibri" w:hAnsi="Calibri" w:cs="Calibri"/>
-          <w:b/>
-          <w:color w:val="0F172A"/>
           <w:sz w:val="18"/>
         </w:rPr>
+      </w:pPr>
+      <w:r>
+        <w:rPr>
+          <w:rFonts w:ascii="Calibri" w:hAnsi="Calibri" w:cs="Calibri"/>
+          <w:b/>
+          <w:color w:val="0F172A"/>
+          <w:sz w:val="20"/>
+        </w:rPr>
         <w:t>Restaurant Management App</w:t>
       </w:r>
       <w:r>
@@ -705,15 +737,15 @@
           <w:rFonts w:ascii="Calibri" w:hAnsi="Calibri" w:cs="Calibri"/>
           <w:b/>
           <w:color w:val="0F172A"/>
+          <w:sz w:val="20"/>
+        </w:rPr>
+        <w:tab/>
+      </w:r>
+      <w:r>
+        <w:rPr>
+          <w:rFonts w:ascii="Calibri" w:hAnsi="Calibri" w:cs="Calibri"/>
+          <w:color w:val="475569"/>
           <w:sz w:val="18"/>
-        </w:rPr>
-        <w:tab/>
-      </w:r>
-      <w:r>
-        <w:rPr>
-          <w:rFonts w:ascii="Calibri" w:hAnsi="Calibri" w:cs="Calibri"/>
-          <w:color w:val="475569"/>
-          <w:sz w:val="17"/>
         </w:rPr>
         <w:t>Academic Group Project</w:t>
       </w:r>
@@ -729,7 +761,7 @@
         <w:rPr>
           <w:rFonts w:ascii="Calibri" w:hAnsi="Calibri" w:cs="Calibri"/>
           <w:color w:val="1E293B"/>
-          <w:sz w:val="17"/>
+          <w:sz w:val="19"/>
         </w:rPr>
       </w:pPr>
       <w:r>
@@ -737,7 +769,7 @@
           <w:rFonts w:ascii="Calibri" w:hAnsi="Calibri" w:cs="Calibri"/>
           <w:b/>
           <w:color w:val="1E3A8A"/>
-          <w:sz w:val="17"/>
+          <w:sz w:val="19"/>
         </w:rPr>
         <w:t xml:space="preserve">Role: </w:t>
       </w:r>
@@ -745,16 +777,16 @@
         <w:rPr>
           <w:rFonts w:ascii="Calibri" w:hAnsi="Calibri" w:cs="Calibri"/>
           <w:color w:val="1E293B"/>
-          <w:sz w:val="17"/>
-        </w:rPr>
-        <w:t xml:space="preserve">Database Design &amp; Menu Management Module   |   </w:t>
+          <w:sz w:val="19"/>
+        </w:rPr>
+        <w:t xml:space="preserve">Database Design, Menu Management &amp; Revenue Report   |   </w:t>
       </w:r>
       <w:r>
         <w:rPr>
           <w:rFonts w:ascii="Calibri" w:hAnsi="Calibri" w:cs="Calibri"/>
           <w:b/>
           <w:color w:val="1E3A8A"/>
-          <w:sz w:val="17"/>
+          <w:sz w:val="19"/>
         </w:rPr>
         <w:t xml:space="preserve">Tech Stack: </w:t>
       </w:r>
@@ -762,7 +794,7 @@
         <w:rPr>
           <w:rFonts w:ascii="Calibri" w:hAnsi="Calibri" w:cs="Calibri"/>
           <w:color w:val="1E293B"/>
-          <w:sz w:val="17"/>
+          <w:sz w:val="19"/>
         </w:rPr>
         <w:t>C#, WinForms, SQL Server, ADO.NET</w:t>
       </w:r>
@@ -779,7 +811,7 @@
           <w:rFonts w:ascii="Calibri" w:hAnsi="Calibri" w:cs="Calibri"/>
           <w:b/>
           <w:color w:val="1E293B"/>
-          <w:sz w:val="17"/>
+          <w:sz w:val="19"/>
         </w:rPr>
       </w:pPr>
       <w:r>
@@ -787,7 +819,7 @@
           <w:rFonts w:ascii="Calibri" w:hAnsi="Calibri" w:cs="Calibri"/>
           <w:b/>
           <w:color w:val="1E3A8A"/>
-          <w:sz w:val="17"/>
+          <w:sz w:val="19"/>
         </w:rPr>
         <w:t xml:space="preserve">GitHub: </w:t>
       </w:r>
@@ -795,6 +827,10 @@
         <w:r>
           <w:rPr>
             <w:rStyle w:val="Hyperlink"/>
+            <w:rFonts w:ascii="Calibri" w:hAnsi="Calibri" w:cs="Calibri"/>
+            <w:color w:val="1D4ED8"/>
+            <w:sz w:val="19"/>
+            <w:u w:val="none"/>
           </w:rPr>
           <w:t>https://github.com/DuyKhoi282/Restaurant-App</w:t>
         </w:r>
@@ -812,16 +848,16 @@
         <w:rPr>
           <w:rFonts w:ascii="Calibri" w:hAnsi="Calibri" w:cs="Calibri"/>
           <w:color w:val="1E293B"/>
-          <w:sz w:val="17"/>
-        </w:rPr>
-      </w:pPr>
-      <w:r>
-        <w:rPr>
-          <w:rFonts w:ascii="Calibri" w:hAnsi="Calibri" w:cs="Calibri"/>
-          <w:color w:val="1E293B"/>
-          <w:sz w:val="17"/>
-        </w:rPr>
-        <w:t>-  Designed the SQL Server database schema, defining primary/foreign key constraints and test datasets.</w:t>
+          <w:sz w:val="19"/>
+        </w:rPr>
+      </w:pPr>
+      <w:r>
+        <w:rPr>
+          <w:rFonts w:ascii="Calibri" w:hAnsi="Calibri" w:cs="Calibri"/>
+          <w:color w:val="1E293B"/>
+          <w:sz w:val="19"/>
+        </w:rPr>
+        <w:t>•  Designed the SQL Server database schema, defining primary/foreign key constraints and test datasets.</w:t>
       </w:r>
     </w:p>
     <w:p>
@@ -836,16 +872,16 @@
         <w:rPr>
           <w:rFonts w:ascii="Calibri" w:hAnsi="Calibri" w:cs="Calibri"/>
           <w:color w:val="1E293B"/>
-          <w:sz w:val="17"/>
-        </w:rPr>
-      </w:pPr>
-      <w:r>
-        <w:rPr>
-          <w:rFonts w:ascii="Calibri" w:hAnsi="Calibri" w:cs="Calibri"/>
-          <w:color w:val="1E293B"/>
-          <w:sz w:val="17"/>
-        </w:rPr>
-        <w:t>-  Developed the Menu Management module with full CRUD operations for food items and food categories.</w:t>
+          <w:sz w:val="19"/>
+        </w:rPr>
+      </w:pPr>
+      <w:r>
+        <w:rPr>
+          <w:rFonts w:ascii="Calibri" w:hAnsi="Calibri" w:cs="Calibri"/>
+          <w:color w:val="1E293B"/>
+          <w:sz w:val="19"/>
+        </w:rPr>
+        <w:t>•  Developed the Menu Management module with full CRUD operations for food items and food categories.</w:t>
       </w:r>
     </w:p>
     <w:p>
@@ -860,16 +896,16 @@
         <w:rPr>
           <w:rFonts w:ascii="Calibri" w:hAnsi="Calibri" w:cs="Calibri"/>
           <w:color w:val="1E293B"/>
-          <w:sz w:val="17"/>
-        </w:rPr>
-      </w:pPr>
-      <w:r>
-        <w:rPr>
-          <w:rFonts w:ascii="Calibri" w:hAnsi="Calibri" w:cs="Calibri"/>
-          <w:color w:val="1E293B"/>
-          <w:sz w:val="17"/>
-        </w:rPr>
-        <w:t>-  Applied parameterized SQL queries to prevent SQL Injection and collation search for accent-insensitive filtering.</w:t>
+          <w:sz w:val="19"/>
+        </w:rPr>
+      </w:pPr>
+      <w:r>
+        <w:rPr>
+          <w:rFonts w:ascii="Calibri" w:hAnsi="Calibri" w:cs="Calibri"/>
+          <w:color w:val="1E293B"/>
+          <w:sz w:val="19"/>
+        </w:rPr>
+        <w:t>•  Applied parameterized SQL queries to prevent SQL Injection and collation search for accent-insensitive filtering.</w:t>
       </w:r>
     </w:p>
     <w:p>
@@ -884,16 +920,40 @@
         <w:rPr>
           <w:rFonts w:ascii="Calibri" w:hAnsi="Calibri" w:cs="Calibri"/>
           <w:color w:val="1E293B"/>
-          <w:sz w:val="17"/>
-        </w:rPr>
-      </w:pPr>
-      <w:r>
-        <w:rPr>
-          <w:rFonts w:ascii="Calibri" w:hAnsi="Calibri" w:cs="Calibri"/>
-          <w:color w:val="1E293B"/>
-          <w:sz w:val="17"/>
-        </w:rPr>
-        <w:t>-  Implemented safe-deletion business logic checking unpaid orders to preserve relational data integrity.</w:t>
+          <w:sz w:val="19"/>
+        </w:rPr>
+      </w:pPr>
+      <w:r>
+        <w:rPr>
+          <w:rFonts w:ascii="Calibri" w:hAnsi="Calibri" w:cs="Calibri"/>
+          <w:color w:val="1E293B"/>
+          <w:sz w:val="19"/>
+        </w:rPr>
+        <w:t>•  Implemented safe-deletion business logic checking unpaid orders to preserve relational data integrity.</w:t>
+      </w:r>
+    </w:p>
+    <w:p>
+      <w:pPr>
+        <w:keepNext/>
+        <w:tabs>
+          <w:tab w:val="right" w:pos="10540"/>
+        </w:tabs>
+        <w:spacing w:after="20" w:line="240" w:lineRule="auto"/>
+        <w:ind w:left="220" w:hanging="220"/>
+        <w:jc w:val="both"/>
+        <w:rPr>
+          <w:rFonts w:ascii="Calibri" w:hAnsi="Calibri" w:cs="Calibri"/>
+          <w:color w:val="1E293B"/>
+          <w:sz w:val="19"/>
+        </w:rPr>
+      </w:pPr>
+      <w:r>
+        <w:rPr>
+          <w:rFonts w:ascii="Calibri" w:hAnsi="Calibri" w:cs="Calibri"/>
+          <w:color w:val="1E293B"/>
+          <w:sz w:val="19"/>
+        </w:rPr>
+        <w:t>•  Built a Revenue Report aggregating sales with SUM/COUNT queries and exporting results to Excel via EPPlus.</w:t>
       </w:r>
     </w:p>
     <w:p>
@@ -905,20 +965,18 @@
         <w:tabs>
           <w:tab w:val="right" w:pos="10540"/>
         </w:tabs>
-        <w:spacing w:before="76" w:after="36" w:line="240" w:lineRule="auto"/>
-        <w:rPr>
-          <w:rFonts w:ascii="Calibri" w:hAnsi="Calibri" w:cs="Calibri"/>
-          <w:b/>
-          <w:color w:val="0F172A"/>
-          <w:sz w:val="20"/>
-        </w:rPr>
-      </w:pPr>
-      <w:r>
-        <w:rPr>
-          <w:rFonts w:ascii="Calibri" w:hAnsi="Calibri" w:cs="Calibri"/>
-          <w:b/>
-          <w:color w:val="0F172A"/>
-          <w:sz w:val="20"/>
+        <w:spacing w:before="140" w:after="60" w:line="240" w:lineRule="auto"/>
+        <w:rPr>
+          <w:rFonts w:ascii="Calibri" w:hAnsi="Calibri" w:cs="Calibri"/>
+          <w:b/>
+          <w:color w:val="0F172A"/>
+        </w:rPr>
+      </w:pPr>
+      <w:r>
+        <w:rPr>
+          <w:rFonts w:ascii="Calibri" w:hAnsi="Calibri" w:cs="Calibri"/>
+          <w:b/>
+          <w:color w:val="0F172A"/>
         </w:rPr>
         <w:t>CERTIFICATIONS &amp; LANGUAGES</w:t>
       </w:r>
@@ -933,25 +991,25 @@
         <w:rPr>
           <w:rFonts w:ascii="Calibri" w:hAnsi="Calibri" w:cs="Calibri"/>
           <w:color w:val="1E293B"/>
-          <w:sz w:val="17"/>
-        </w:rPr>
-      </w:pPr>
-      <w:r>
-        <w:rPr>
-          <w:rFonts w:ascii="Calibri" w:hAnsi="Calibri" w:cs="Calibri"/>
-          <w:b/>
-          <w:color w:val="0F172A"/>
-          <w:sz w:val="17"/>
-        </w:rPr>
-        <w:t xml:space="preserve">- English Proficiency: </w:t>
-      </w:r>
-      <w:r>
-        <w:rPr>
-          <w:rFonts w:ascii="Calibri" w:hAnsi="Calibri" w:cs="Calibri"/>
-          <w:color w:val="1E293B"/>
-          <w:sz w:val="17"/>
-        </w:rPr>
-        <w:t>VSTEP Level 7.0 (2026)   |   IELTS Overall Band Score 5.5 (2022)</w:t>
+          <w:sz w:val="19"/>
+        </w:rPr>
+      </w:pPr>
+      <w:r>
+        <w:rPr>
+          <w:rFonts w:ascii="Calibri" w:hAnsi="Calibri" w:cs="Calibri"/>
+          <w:b/>
+          <w:color w:val="0F172A"/>
+          <w:sz w:val="19"/>
+        </w:rPr>
+        <w:t xml:space="preserve">• English: </w:t>
+      </w:r>
+      <w:r>
+        <w:rPr>
+          <w:rFonts w:ascii="Calibri" w:hAnsi="Calibri" w:cs="Calibri"/>
+          <w:color w:val="1E293B"/>
+          <w:sz w:val="19"/>
+        </w:rPr>
+        <w:t>VSTEP 7.0/10 – CEFR B2 (2026)   |   IELTS 5.5 (2022)</w:t>
       </w:r>
     </w:p>
     <w:p>
@@ -963,20 +1021,18 @@
         <w:tabs>
           <w:tab w:val="right" w:pos="10540"/>
         </w:tabs>
-        <w:spacing w:before="76" w:after="36" w:line="240" w:lineRule="auto"/>
-        <w:rPr>
-          <w:rFonts w:ascii="Calibri" w:hAnsi="Calibri" w:cs="Calibri"/>
-          <w:b/>
-          <w:color w:val="0F172A"/>
-          <w:sz w:val="20"/>
-        </w:rPr>
-      </w:pPr>
-      <w:r>
-        <w:rPr>
-          <w:rFonts w:ascii="Calibri" w:hAnsi="Calibri" w:cs="Calibri"/>
-          <w:b/>
-          <w:color w:val="0F172A"/>
-          <w:sz w:val="20"/>
+        <w:spacing w:before="140" w:after="60" w:line="240" w:lineRule="auto"/>
+        <w:rPr>
+          <w:rFonts w:ascii="Calibri" w:hAnsi="Calibri" w:cs="Calibri"/>
+          <w:b/>
+          <w:color w:val="0F172A"/>
+        </w:rPr>
+      </w:pPr>
+      <w:r>
+        <w:rPr>
+          <w:rFonts w:ascii="Calibri" w:hAnsi="Calibri" w:cs="Calibri"/>
+          <w:b/>
+          <w:color w:val="0F172A"/>
         </w:rPr>
         <w:t>ACHIEVEMENTS</w:t>
       </w:r>
@@ -991,24 +1047,31 @@
         <w:rPr>
           <w:rFonts w:ascii="Calibri" w:hAnsi="Calibri" w:cs="Calibri"/>
           <w:color w:val="475569"/>
-          <w:sz w:val="17"/>
-        </w:rPr>
-      </w:pPr>
-      <w:r>
-        <w:rPr>
-          <w:rFonts w:ascii="Calibri" w:hAnsi="Calibri" w:cs="Calibri"/>
-          <w:b/>
-          <w:color w:val="0F172A"/>
-          <w:sz w:val="17"/>
-        </w:rPr>
-        <w:t>- Consolation Prize - Cybernet Competition 2025</w:t>
-      </w:r>
-      <w:r>
-        <w:rPr>
-          <w:rFonts w:ascii="Calibri" w:hAnsi="Calibri" w:cs="Calibri"/>
-          <w:b/>
-          <w:color w:val="0F172A"/>
-          <w:sz w:val="17"/>
+          <w:sz w:val="19"/>
+        </w:rPr>
+      </w:pPr>
+      <w:r>
+        <w:rPr>
+          <w:rFonts w:ascii="Calibri" w:hAnsi="Calibri" w:cs="Calibri"/>
+          <w:b/>
+          <w:color w:val="0F172A"/>
+          <w:sz w:val="19"/>
+        </w:rPr>
+        <w:t>• Consolation Prize – Cybernet Competition 2025</w:t>
+      </w:r>
+      <w:r>
+        <w:rPr>
+          <w:rFonts w:ascii="Calibri" w:hAnsi="Calibri" w:cs="Calibri"/>
+          <w:color w:val="1E293B"/>
+          <w:sz w:val="19"/>
+        </w:rPr>
+        <w:t>: university-level cybersecurity competition</w:t>
+      </w:r>
+      <w:r>
+        <w:rPr>
+          <w:rFonts w:ascii="Calibri" w:hAnsi="Calibri" w:cs="Calibri"/>
+          <w:color w:val="1E293B"/>
+          <w:sz w:val="19"/>
         </w:rPr>
         <w:tab/>
       </w:r>
@@ -1016,9 +1079,9 @@
         <w:rPr>
           <w:rFonts w:ascii="Calibri" w:hAnsi="Calibri" w:cs="Calibri"/>
           <w:color w:val="475569"/>
-          <w:sz w:val="17"/>
-        </w:rPr>
-        <w:t>University of Economics and Finance (UEF)</w:t>
+          <w:sz w:val="19"/>
+        </w:rPr>
+        <w:t>UEF</w:t>
       </w:r>
     </w:p>
     <w:p>
@@ -1030,20 +1093,18 @@
         <w:tabs>
           <w:tab w:val="right" w:pos="10540"/>
         </w:tabs>
-        <w:spacing w:before="76" w:after="36" w:line="240" w:lineRule="auto"/>
-        <w:rPr>
-          <w:rFonts w:ascii="Calibri" w:hAnsi="Calibri" w:cs="Calibri"/>
-          <w:b/>
-          <w:color w:val="0F172A"/>
-          <w:sz w:val="20"/>
-        </w:rPr>
-      </w:pPr>
-      <w:r>
-        <w:rPr>
-          <w:rFonts w:ascii="Calibri" w:hAnsi="Calibri" w:cs="Calibri"/>
-          <w:b/>
-          <w:color w:val="0F172A"/>
-          <w:sz w:val="20"/>
+        <w:spacing w:before="140" w:after="60" w:line="240" w:lineRule="auto"/>
+        <w:rPr>
+          <w:rFonts w:ascii="Calibri" w:hAnsi="Calibri" w:cs="Calibri"/>
+          <w:b/>
+          <w:color w:val="0F172A"/>
+        </w:rPr>
+      </w:pPr>
+      <w:r>
+        <w:rPr>
+          <w:rFonts w:ascii="Calibri" w:hAnsi="Calibri" w:cs="Calibri"/>
+          <w:b/>
+          <w:color w:val="0F172A"/>
         </w:rPr>
         <w:t>REFERENCES</w:t>
       </w:r>
@@ -1058,15 +1119,15 @@
         <w:rPr>
           <w:rFonts w:ascii="Calibri" w:hAnsi="Calibri" w:cs="Calibri"/>
           <w:color w:val="1E293B"/>
-          <w:sz w:val="17"/>
-        </w:rPr>
-      </w:pPr>
-      <w:r>
-        <w:rPr>
-          <w:rFonts w:ascii="Calibri" w:hAnsi="Calibri" w:cs="Calibri"/>
-          <w:b/>
-          <w:color w:val="0F172A"/>
-          <w:sz w:val="17"/>
+          <w:sz w:val="19"/>
+        </w:rPr>
+      </w:pPr>
+      <w:r>
+        <w:rPr>
+          <w:rFonts w:ascii="Calibri" w:hAnsi="Calibri" w:cs="Calibri"/>
+          <w:b/>
+          <w:color w:val="0F172A"/>
+          <w:sz w:val="19"/>
         </w:rPr>
         <w:t>Dr. Hoang Van Hieu - University of Economics and Finance (UEF)</w:t>
       </w:r>
@@ -1075,7 +1136,7 @@
           <w:rFonts w:ascii="Calibri" w:hAnsi="Calibri" w:cs="Calibri"/>
           <w:b/>
           <w:color w:val="0F172A"/>
-          <w:sz w:val="17"/>
+          <w:sz w:val="19"/>
         </w:rPr>
         <w:tab/>
       </w:r>
@@ -1083,7 +1144,7 @@
         <w:rPr>
           <w:rFonts w:ascii="Calibri" w:hAnsi="Calibri" w:cs="Calibri"/>
           <w:color w:val="1E293B"/>
-          <w:sz w:val="17"/>
+          <w:sz w:val="19"/>
         </w:rPr>
         <w:t xml:space="preserve">Email: </w:t>
       </w:r>
@@ -1091,6 +1152,10 @@
         <w:r>
           <w:rPr>
             <w:rStyle w:val="Hyperlink"/>
+            <w:rFonts w:ascii="Calibri" w:hAnsi="Calibri" w:cs="Calibri"/>
+            <w:color w:val="1D4ED8"/>
+            <w:sz w:val="19"/>
+            <w:u w:val="none"/>
           </w:rPr>
           <w:t>hieuhv@uef.edu.vn</w:t>
         </w:r>
@@ -1106,7 +1171,7 @@
         <w:rPr>
           <w:rFonts w:ascii="Calibri" w:hAnsi="Calibri" w:cs="Calibri"/>
           <w:color w:val="1E293B"/>
-          <w:sz w:val="17"/>
+          <w:sz w:val="19"/>
         </w:rPr>
       </w:pPr>
     </w:p>
@@ -1530,7 +1595,7 @@
     <w:link w:val="Heading1Char"/>
     <w:uiPriority w:val="9"/>
     <w:qFormat/>
-    <w:rsid w:val="001E0A6C"/>
+    <w:rsid w:val="00283305"/>
     <w:pPr>
       <w:keepNext/>
       <w:keepLines/>
@@ -1553,7 +1618,7 @@
     <w:semiHidden/>
     <w:unhideWhenUsed/>
     <w:qFormat/>
-    <w:rsid w:val="001E0A6C"/>
+    <w:rsid w:val="00283305"/>
     <w:pPr>
       <w:keepNext/>
       <w:keepLines/>
@@ -1576,7 +1641,7 @@
     <w:semiHidden/>
     <w:unhideWhenUsed/>
     <w:qFormat/>
-    <w:rsid w:val="001E0A6C"/>
+    <w:rsid w:val="00283305"/>
     <w:pPr>
       <w:keepNext/>
       <w:keepLines/>
@@ -1599,7 +1664,7 @@
     <w:semiHidden/>
     <w:unhideWhenUsed/>
     <w:qFormat/>
-    <w:rsid w:val="001E0A6C"/>
+    <w:rsid w:val="00283305"/>
     <w:pPr>
       <w:keepNext/>
       <w:keepLines/>
@@ -1622,7 +1687,7 @@
     <w:semiHidden/>
     <w:unhideWhenUsed/>
     <w:qFormat/>
-    <w:rsid w:val="001E0A6C"/>
+    <w:rsid w:val="00283305"/>
     <w:pPr>
       <w:keepNext/>
       <w:keepLines/>
@@ -1643,7 +1708,7 @@
     <w:semiHidden/>
     <w:unhideWhenUsed/>
     <w:qFormat/>
-    <w:rsid w:val="001E0A6C"/>
+    <w:rsid w:val="00283305"/>
     <w:pPr>
       <w:keepNext/>
       <w:keepLines/>
@@ -1666,7 +1731,7 @@
     <w:semiHidden/>
     <w:unhideWhenUsed/>
     <w:qFormat/>
-    <w:rsid w:val="001E0A6C"/>
+    <w:rsid w:val="00283305"/>
     <w:pPr>
       <w:keepNext/>
       <w:keepLines/>
@@ -1687,7 +1752,7 @@
     <w:semiHidden/>
     <w:unhideWhenUsed/>
     <w:qFormat/>
-    <w:rsid w:val="001E0A6C"/>
+    <w:rsid w:val="00283305"/>
     <w:pPr>
       <w:keepNext/>
       <w:keepLines/>
@@ -1710,7 +1775,7 @@
     <w:semiHidden/>
     <w:unhideWhenUsed/>
     <w:qFormat/>
-    <w:rsid w:val="001E0A6C"/>
+    <w:rsid w:val="00283305"/>
     <w:pPr>
       <w:keepNext/>
       <w:keepLines/>
@@ -1754,7 +1819,7 @@
     <w:basedOn w:val="DefaultParagraphFont"/>
     <w:link w:val="Heading1"/>
     <w:uiPriority w:val="9"/>
-    <w:rsid w:val="001E0A6C"/>
+    <w:rsid w:val="00283305"/>
     <w:rPr>
       <w:rFonts w:asciiTheme="majorHAnsi" w:eastAsiaTheme="majorEastAsia" w:hAnsiTheme="majorHAnsi" w:cstheme="majorBidi"/>
       <w:color w:val="2F5496" w:themeColor="accent1" w:themeShade="BF"/>
@@ -1768,7 +1833,7 @@
     <w:link w:val="Heading2"/>
     <w:uiPriority w:val="9"/>
     <w:semiHidden/>
-    <w:rsid w:val="001E0A6C"/>
+    <w:rsid w:val="00283305"/>
     <w:rPr>
       <w:rFonts w:asciiTheme="majorHAnsi" w:eastAsiaTheme="majorEastAsia" w:hAnsiTheme="majorHAnsi" w:cstheme="majorBidi"/>
       <w:color w:val="2F5496" w:themeColor="accent1" w:themeShade="BF"/>
@@ -1782,7 +1847,7 @@
     <w:link w:val="Heading3"/>
     <w:uiPriority w:val="9"/>
     <w:semiHidden/>
-    <w:rsid w:val="001E0A6C"/>
+    <w:rsid w:val="00283305"/>
     <w:rPr>
       <w:rFonts w:eastAsiaTheme="majorEastAsia" w:cstheme="majorBidi"/>
       <w:color w:val="2F5496" w:themeColor="accent1" w:themeShade="BF"/>
@@ -1796,7 +1861,7 @@
     <w:link w:val="Heading4"/>
     <w:uiPriority w:val="9"/>
     <w:semiHidden/>
-    <w:rsid w:val="001E0A6C"/>
+    <w:rsid w:val="00283305"/>
     <w:rPr>
       <w:rFonts w:eastAsiaTheme="majorEastAsia" w:cstheme="majorBidi"/>
       <w:i/>
@@ -1810,7 +1875,7 @@
     <w:link w:val="Heading5"/>
     <w:uiPriority w:val="9"/>
     <w:semiHidden/>
-    <w:rsid w:val="001E0A6C"/>
+    <w:rsid w:val="00283305"/>
     <w:rPr>
       <w:rFonts w:eastAsiaTheme="majorEastAsia" w:cstheme="majorBidi"/>
       <w:color w:val="2F5496" w:themeColor="accent1" w:themeShade="BF"/>
@@ -1822,7 +1887,7 @@
     <w:link w:val="Heading6"/>
     <w:uiPriority w:val="9"/>
     <w:semiHidden/>
-    <w:rsid w:val="001E0A6C"/>
+    <w:rsid w:val="00283305"/>
     <w:rPr>
       <w:rFonts w:eastAsiaTheme="majorEastAsia" w:cstheme="majorBidi"/>
       <w:i/>
@@ -1836,7 +1901,7 @@
     <w:link w:val="Heading7"/>
     <w:uiPriority w:val="9"/>
     <w:semiHidden/>
-    <w:rsid w:val="001E0A6C"/>
+    <w:rsid w:val="00283305"/>
     <w:rPr>
       <w:rFonts w:eastAsiaTheme="majorEastAsia" w:cstheme="majorBidi"/>
       <w:color w:val="595959" w:themeColor="text1" w:themeTint="A6"/>
@@ -1848,7 +1913,7 @@
     <w:link w:val="Heading8"/>
     <w:uiPriority w:val="9"/>
     <w:semiHidden/>
-    <w:rsid w:val="001E0A6C"/>
+    <w:rsid w:val="00283305"/>
     <w:rPr>
       <w:rFonts w:eastAsiaTheme="majorEastAsia" w:cstheme="majorBidi"/>
       <w:i/>
@@ -1862,7 +1927,7 @@
     <w:link w:val="Heading9"/>
     <w:uiPriority w:val="9"/>
     <w:semiHidden/>
-    <w:rsid w:val="001E0A6C"/>
+    <w:rsid w:val="00283305"/>
     <w:rPr>
       <w:rFonts w:eastAsiaTheme="majorEastAsia" w:cstheme="majorBidi"/>
       <w:color w:val="272727" w:themeColor="text1" w:themeTint="D8"/>
@@ -1875,7 +1940,7 @@
     <w:link w:val="TitleChar"/>
     <w:uiPriority w:val="10"/>
     <w:qFormat/>
-    <w:rsid w:val="001E0A6C"/>
+    <w:rsid w:val="00283305"/>
     <w:pPr>
       <w:spacing w:after="80" w:line="240" w:lineRule="auto"/>
       <w:contextualSpacing/>
@@ -1893,7 +1958,7 @@
     <w:basedOn w:val="DefaultParagraphFont"/>
     <w:link w:val="Title"/>
     <w:uiPriority w:val="10"/>
-    <w:rsid w:val="001E0A6C"/>
+    <w:rsid w:val="00283305"/>
     <w:rPr>
       <w:rFonts w:asciiTheme="majorHAnsi" w:eastAsiaTheme="majorEastAsia" w:hAnsiTheme="majorHAnsi" w:cstheme="majorBidi"/>
       <w:spacing w:val="-10"/>
@@ -1909,7 +1974,7 @@
     <w:link w:val="SubtitleChar"/>
     <w:uiPriority w:val="11"/>
     <w:qFormat/>
-    <w:rsid w:val="001E0A6C"/>
+    <w:rsid w:val="00283305"/>
     <w:pPr>
       <w:numPr>
         <w:ilvl w:val="1"/>
@@ -1928,7 +1993,7 @@
     <w:basedOn w:val="DefaultParagraphFont"/>
     <w:link w:val="Subtitle"/>
     <w:uiPriority w:val="11"/>
-    <w:rsid w:val="001E0A6C"/>
+    <w:rsid w:val="00283305"/>
     <w:rPr>
       <w:rFonts w:eastAsiaTheme="majorEastAsia" w:cstheme="majorBidi"/>
       <w:color w:val="595959" w:themeColor="text1" w:themeTint="A6"/>
@@ -1944,7 +2009,7 @@
     <w:link w:val="QuoteChar"/>
     <w:uiPriority w:val="29"/>
     <w:qFormat/>
-    <w:rsid w:val="001E0A6C"/>
+    <w:rsid w:val="00283305"/>
     <w:pPr>
       <w:spacing w:before="160"/>
       <w:jc w:val="center"/>
@@ -1960,7 +2025,7 @@
     <w:basedOn w:val="DefaultParagraphFont"/>
     <w:link w:val="Quote"/>
     <w:uiPriority w:val="29"/>
-    <w:rsid w:val="001E0A6C"/>
+    <w:rsid w:val="00283305"/>
     <w:rPr>
       <w:rFonts w:cs="Mangal"/>
       <w:i/>
@@ -1973,7 +2038,7 @@
     <w:basedOn w:val="Normal"/>
     <w:uiPriority w:val="34"/>
     <w:qFormat/>
-    <w:rsid w:val="001E0A6C"/>
+    <w:rsid w:val="00283305"/>
     <w:pPr>
       <w:ind w:left="720"/>
       <w:contextualSpacing/>
@@ -1984,7 +2049,7 @@
     <w:basedOn w:val="DefaultParagraphFont"/>
     <w:uiPriority w:val="21"/>
     <w:qFormat/>
-    <w:rsid w:val="001E0A6C"/>
+    <w:rsid w:val="00283305"/>
     <w:rPr>
       <w:i/>
       <w:iCs/>
@@ -1998,7 +2063,7 @@
     <w:link w:val="IntenseQuoteChar"/>
     <w:uiPriority w:val="30"/>
     <w:qFormat/>
-    <w:rsid w:val="001E0A6C"/>
+    <w:rsid w:val="00283305"/>
     <w:pPr>
       <w:pBdr>
         <w:top w:val="single" w:sz="4" w:space="10" w:color="2F5496" w:themeColor="accent1" w:themeShade="BF"/>
@@ -2019,7 +2084,7 @@
     <w:basedOn w:val="DefaultParagraphFont"/>
     <w:link w:val="IntenseQuote"/>
     <w:uiPriority w:val="30"/>
-    <w:rsid w:val="001E0A6C"/>
+    <w:rsid w:val="00283305"/>
     <w:rPr>
       <w:rFonts w:cs="Mangal"/>
       <w:i/>
@@ -2032,7 +2097,7 @@
     <w:basedOn w:val="DefaultParagraphFont"/>
     <w:uiPriority w:val="32"/>
     <w:qFormat/>
-    <w:rsid w:val="001E0A6C"/>
+    <w:rsid w:val="00283305"/>
     <w:rPr>
       <w:b/>
       <w:bCs/>
@@ -2046,7 +2111,7 @@
     <w:basedOn w:val="DefaultParagraphFont"/>
     <w:uiPriority w:val="99"/>
     <w:unhideWhenUsed/>
-    <w:rsid w:val="001E0A6C"/>
+    <w:rsid w:val="00283305"/>
     <w:rPr>
       <w:color w:val="0563C1" w:themeColor="hyperlink"/>
       <w:u w:val="single"/>
@@ -2058,7 +2123,7 @@
     <w:uiPriority w:val="99"/>
     <w:semiHidden/>
     <w:unhideWhenUsed/>
-    <w:rsid w:val="001E0A6C"/>
+    <w:rsid w:val="00283305"/>
     <w:rPr>
       <w:color w:val="605E5C"/>
       <w:shd w:val="clear" w:color="auto" w:fill="E1DFDD"/>

</xml_diff>